<commit_message>
Añadir escudo de la I.E. John F. Kennedy y explicación de cada familia
- Escudo en la cabecera, en el hueco superior de la tabla, en el pie de página y como icono de la pestaña.
- Al seleccionar un filtro aparece una nota breve con la descripción de la familia.
- La leyenda "Familias químicas" abre una ventana con la explicación y un botón para verla en la tabla.
- Actualizados readme y manual de usuario (Markdown y Word).

Co-Authored-By: Claude Opus 5.5 <noreply@anthropic.com>
</commit_message>
<xml_diff>
--- a/MANUAL-USUARIO-ELEMENTA.docx
+++ b/MANUAL-USUARIO-ELEMENTA.docx
@@ -199,7 +199,7 @@
         <w:pStyle w:val="Lista"/>
       </w:pPr>
       <w:r>
-        <w:t>•  Encabezado: contiene la marca Elementa y el control para cambiar entre tema claro y oscuro.</w:t>
+        <w:t xml:space="preserve">•  Encabezado: contiene la marca Elementa, el escudo de la Institución Educativa John F. Kennedy y el control para cambiar entre tema claro y oscuro.</w:t>
       </w:r>
     </w:p>
     <w:p>
@@ -246,26 +246,31 @@
         <w:pStyle w:val="Lista"/>
       </w:pPr>
       <w:r>
-        <w:t>•  Filtros por familia: muestran categorías químicas que se pueden combinar entre sí y con la búsqueda.</w:t>
-      </w:r>
-    </w:p>
-    <w:p>
-      <w:pPr>
-        <w:pStyle w:val="Lista"/>
-      </w:pPr>
-      <w:r>
-        <w:t xml:space="preserve">•  Tabla o lista: cada elemento aparece como una tarjeta </w:t>
-      </w:r>
-      <w:r>
-        <w:t>seleccionable.</w:t>
-      </w:r>
-    </w:p>
-    <w:p>
-      <w:pPr>
-        <w:pStyle w:val="Lista"/>
-      </w:pPr>
-      <w:r>
-        <w:t>•  Leyenda y guía: ayudan a interpretar los colores y los datos que aparecen en las tarjetas.</w:t>
+        <w:t xml:space="preserve">•  Filtros por familia: muestran categorías químicas que se pueden combinar entre sí y con la búsqueda. Al seleccionar una familia aparece una explicación breve de lo que la caracteriza.</w:t>
+      </w:r>
+    </w:p>
+    <w:p>
+      <w:pPr>
+        <w:pStyle w:val="Lista"/>
+      </w:pPr>
+      <w:r>
+        <w:t xml:space="preserve">•  Tabla o lista: cada elemento aparece como una tarjeta seleccionable. El espacio libre de la parte superior de la tabla muestra el escudo y el nombre de la institución.</w:t>
+      </w:r>
+    </w:p>
+    <w:p>
+      <w:pPr>
+        <w:pStyle w:val="Lista"/>
+      </w:pPr>
+      <w:r>
+        <w:t xml:space="preserve">•  Leyenda y guía: ayudan a interpretar los colores y los datos que aparecen en las tarjetas. Cada familia de la leyenda se puede pulsar para ver qué es.</w:t>
+      </w:r>
+    </w:p>
+    <w:p>
+      <w:pPr>
+        <w:pStyle w:val="Lista"/>
+      </w:pPr>
+      <w:r>
+        <w:t xml:space="preserve">•  Pie de página: incluye el escudo y el nombre de la institución.</w:t>
       </w:r>
     </w:p>
     <w:p>
@@ -389,6 +394,35 @@
       <w:proofErr w:type="spellEnd"/>
       <w:r>
         <w:t>, metaloides, no metales, halógenos, gases nobles, lantánidos y actínidos. La leyenda de la página muestra sus colores.</w:t>
+      </w:r>
+    </w:p>
+    <w:p>
+      <w:pPr>
+        <w:pStyle w:val="Ttulo3"/>
+      </w:pPr>
+      <w:r>
+        <w:t xml:space="preserve">Saber qué es cada familia</w:t>
+      </w:r>
+    </w:p>
+    <w:p>
+      <w:r>
+        <w:t xml:space="preserve">Hay dos formas de ver la explicación de una familia:</w:t>
+      </w:r>
+    </w:p>
+    <w:p>
+      <w:pPr>
+        <w:pStyle w:val="Lista"/>
+      </w:pPr>
+      <w:r>
+        <w:t xml:space="preserve">•  Desde los filtros: al pulsar una familia, debajo de los filtros aparece un recuadro con su nombre, la cantidad de elementos que la forman y una descripción corta. Si eliges varias, se muestra la última que seleccionaste.</w:t>
+      </w:r>
+    </w:p>
+    <w:p>
+      <w:pPr>
+        <w:pStyle w:val="Lista"/>
+      </w:pPr>
+      <w:r>
+        <w:t xml:space="preserve">•  Desde la leyenda «Familias químicas»: pulsa el nombre de una familia y se abre una pequeña ventana con su explicación. El botón Ver en la tabla aplica ese filtro y te lleva a la tabla. Para cerrar la ventana, pulsa la ×, haz clic fuera de ella, pulsa Escape o vuelve a pulsar la misma familia.</w:t>
       </w:r>
     </w:p>
     <w:p>
@@ -599,7 +633,7 @@
         <w:pStyle w:val="TableText"/>
       </w:pPr>
       <w:r>
-        <w:t>Escape     |     Cierra sugerencias o la ficha abierta.</w:t>
+        <w:t xml:space="preserve">Escape     |     Cierra sugerencias, la explicación de una familia o la ficha abierta.</w:t>
       </w:r>
     </w:p>
     <w:p>
@@ -905,6 +939,14 @@
       <w:pPr>
         <w:pStyle w:val="TableText"/>
       </w:pPr>
+      <w:r>
+        <w:t xml:space="preserve">img/     |     Contiene logo-jfk.png, el escudo de la institución que aparece en el encabezado, la tabla, el pie de página y la pestaña del navegador.</w:t>
+      </w:r>
+    </w:p>
+    <w:p>
+      <w:pPr>
+        <w:pStyle w:val="TableText"/>
+      </w:pPr>
       <w:proofErr w:type="spellStart"/>
       <w:r>
         <w:t>js</w:t>
@@ -1267,6 +1309,19 @@
         <w:pStyle w:val="Ttulo3"/>
       </w:pPr>
       <w:r>
+        <w:t xml:space="preserve">Cambiar la explicación de una familia</w:t>
+      </w:r>
+    </w:p>
+    <w:p>
+      <w:r>
+        <w:t xml:space="preserve">Las descripciones de cada familia están en js/app.js, en la lista categories, dentro del campo description. Guarda el archivo y vuelve a cargar la página.</w:t>
+      </w:r>
+    </w:p>
+    <w:p>
+      <w:pPr>
+        <w:pStyle w:val="Ttulo3"/>
+      </w:pPr>
+      <w:r>
         <w:t>Cambiar datos químicos</w:t>
       </w:r>
     </w:p>
@@ -1365,35 +1420,7 @@
     </w:p>
     <w:p>
       <w:r>
-        <w:lastRenderedPageBreak/>
-        <w:t xml:space="preserve">Para alojarla como sitio estático, conserva las rutas relativas y publica index.html, </w:t>
-      </w:r>
-      <w:proofErr w:type="spellStart"/>
-      <w:r>
-        <w:t>css</w:t>
-      </w:r>
-      <w:proofErr w:type="spellEnd"/>
-      <w:r>
-        <w:t xml:space="preserve">/styles.css, </w:t>
-      </w:r>
-      <w:proofErr w:type="spellStart"/>
-      <w:r>
-        <w:t>js</w:t>
-      </w:r>
-      <w:proofErr w:type="spellEnd"/>
-      <w:r>
-        <w:t xml:space="preserve">/app.js, </w:t>
-      </w:r>
-      <w:proofErr w:type="spellStart"/>
-      <w:r>
-        <w:t>js</w:t>
-      </w:r>
-      <w:proofErr w:type="spellEnd"/>
-      <w:r>
-        <w:t>/elements-data.js y data/editorial-es.js. Las fuentes JSON y los scripts solo son necesarios si se plan</w:t>
-      </w:r>
-      <w:r>
-        <w:t>ea mantener y regenerar los datos. No hace falta publicar los perfiles .browser-* ni las capturas.</w:t>
+        <w:t xml:space="preserve">Para alojarla como sitio estático, conserva las rutas relativas y publica index.html, css/styles.css, js/app.js, js/elements-data.js, data/editorial-es.js e img/logo-jfk.png. Las fuentes JSON y los scripts solo son necesarios si se planea mantener y regenerar los datos. No hace falta publicar los perfiles .browser-* ni las capturas.</w:t>
       </w:r>
     </w:p>
     <w:p>

</xml_diff>